<commit_message>
Remove AI disclosure section
</commit_message>
<xml_diff>
--- a/paper.docx
+++ b/paper.docx
@@ -436,7 +436,7 @@
           <w:sz w:val="24"/>
           <w:szCs w:val="24"/>
         </w:rPr>
-        <w:t xml:space="preserve">Full seed control was implemented to ensure reproducibility. Random seeds were fixed for NumPy, PyTorch (including CUDA and cuDNN deterministic mode), and DataLoader worker initialization. The complete analysis code, including data preprocessing, model implementations, and evaluation scripts, is available at https://github.com/iraklimatch/Benchmarking-knowledge-tracing-methods-across-five-educational-datasets.</w:t>
+        <w:t xml:space="preserve">Full seed control was implemented to ensure reproducibility. Random seeds were fixed for NumPy, PyTorch (including CUDA and cuDNN deterministic mode), and DataLoader worker initialization. The complete analysis code, including data preprocessing, model implementations, and evaluation scripts, is available at https://github.com/iraklimatch/Benchmarking-knowledge-tracing-methods.</w:t>
       </w:r>
     </w:p>
     <w:p>
@@ -11470,35 +11470,6 @@
           <w:szCs w:val="24"/>
         </w:rPr>
         <w:t xml:space="preserve">Yudelson, M. V., Koedinger, K. R., &amp; Gordon, G. J. (2013). Individualized Bayesian knowledge tracing models. In Proceedings of the 16th International Conference on Artificial Intelligence in Education (pp. 171--180). Springer.</w:t>
-      </w:r>
-    </w:p>
-    <w:p>
-      <w:pPr>
-        <w:pStyle w:val="Heading1"/>
-        <w:spacing w:after="200" w:before="360"/>
-      </w:pPr>
-      <w:r>
-        <w:rPr>
-          <w:rFonts w:ascii="Times New Roman" w:cs="Times New Roman" w:eastAsia="Times New Roman" w:hAnsi="Times New Roman"/>
-          <w:b/>
-          <w:bCs/>
-          <w:sz w:val="28"/>
-          <w:szCs w:val="28"/>
-        </w:rPr>
-        <w:t xml:space="preserve">Use of generative AI</w:t>
-      </w:r>
-    </w:p>
-    <w:p>
-      <w:pPr>
-        <w:spacing w:after="200" w:line="360"/>
-      </w:pPr>
-      <w:r>
-        <w:rPr>
-          <w:rFonts w:ascii="Times New Roman" w:cs="Times New Roman" w:eastAsia="Times New Roman" w:hAnsi="Times New Roman"/>
-          <w:sz w:val="24"/>
-          <w:szCs w:val="24"/>
-        </w:rPr>
-        <w:t xml:space="preserve">This manuscript was prepared with the assistance of Claude (Anthropic), a large language model. Claude was used for data processing pipeline development, benchmark code generation, statistical analysis execution, and visualization generation. All experimental design decisions, methodological choices, interpretation of results, and intellectual contributions were made by the author. The analysis code and all generated results were reviewed and validated by the author.</w:t>
       </w:r>
     </w:p>
     <w:sectPr>

</xml_diff>